<commit_message>
feat(governance): enforce rule-based architecture freeze, eliminate golden document dependencies, and enact master governance specification
</commit_message>
<xml_diff>
--- a/backend/baseline/official_production_valuation_report.docx
+++ b/backend/baseline/official_production_valuation_report.docx
@@ -18582,142 +18582,10 @@
     <w:p/>
     <w:p>
       <w:r>
-        <w:rPr>
-          <w:b/>
-          <w:color w:val="003366"/>
-        </w:rPr>
-        <w:t>Value of the Property</w:t>
+        <w:t>&lt;&lt;VALUE_OF_PROPERTY_TABLE&gt;&gt;</w:t>
       </w:r>
     </w:p>
-    <w:tbl>
-      <w:tblPr>
-        <w:tblBorders>
-          <w:top w:val="single" w:color="CCCCCC" w:sz="4"/>
-          <w:left w:val="single" w:color="CCCCCC" w:sz="4"/>
-          <w:bottom w:val="single" w:color="CCCCCC" w:sz="4"/>
-          <w:right w:val="single" w:color="CCCCCC" w:sz="4"/>
-          <w:insideH w:val="single" w:color="CCCCCC" w:sz="4"/>
-          <w:insideV w:val="single" w:color="CCCCCC" w:sz="4"/>
-        </w:tblBorders>
-        <w:tblLayout w:type="fixed"/>
-      </w:tblPr>
-      <w:tr>
-        <w:tc>
-          <w:tcPr>
-            <w:shd w:val="clear" w:color="auto" w:fill="EAEAEA"/>
-          </w:tcPr>
-          <w:p>
-            <w:r>
-              <w:rPr>
-                <w:b/>
-              </w:rPr>
-              <w:t>VALUE OF THE PROPERTY</w:t>
-            </w:r>
-          </w:p>
-        </w:tc>
-        <w:tc>
-          <w:tcPr>
-            <w:shd w:val="clear" w:color="auto" w:fill="EAEAEA"/>
-          </w:tcPr>
-          <w:p>
-            <w:r>
-              <w:rPr>
-                <w:b/>
-              </w:rPr>
-              <w:t>AMOUNT (INR)</w:t>
-            </w:r>
-          </w:p>
-        </w:tc>
-      </w:tr>
-      <w:tr>
-        <w:tc>
-          <w:p>
-            <w:r>
-              <w:t>Value of Land</w:t>
-            </w:r>
-          </w:p>
-        </w:tc>
-        <w:tc>
-          <w:p>
-            <w:r>
-              <w:t>INR &lt;&lt;total_land_value&gt;&gt;</w:t>
-            </w:r>
-          </w:p>
-        </w:tc>
-      </w:tr>
-      <w:tr>
-        <w:tc>
-          <w:p>
-            <w:r>
-              <w:t>Value of Buildings</w:t>
-            </w:r>
-          </w:p>
-        </w:tc>
-        <w:tc>
-          <w:p>
-            <w:r>
-              <w:t>INR &lt;&lt;total_building_value&gt;&gt;</w:t>
-            </w:r>
-          </w:p>
-        </w:tc>
-      </w:tr>
-      <w:tr>
-        <w:tc>
-          <w:tcPr>
-            <w:shd w:val="clear" w:color="auto" w:fill="F5F5F5"/>
-          </w:tcPr>
-          <w:p>
-            <w:r>
-              <w:rPr>
-                <w:b/>
-              </w:rPr>
-              <w:t>Total</w:t>
-            </w:r>
-          </w:p>
-        </w:tc>
-        <w:tc>
-          <w:tcPr>
-            <w:shd w:val="clear" w:color="auto" w:fill="F5F5F5"/>
-          </w:tcPr>
-          <w:p>
-            <w:r>
-              <w:rPr>
-                <w:b/>
-              </w:rPr>
-              <w:t>INR &lt;&lt;fair_value&gt;&gt;</w:t>
-            </w:r>
-          </w:p>
-        </w:tc>
-      </w:tr>
-      <w:tr>
-        <w:tc>
-          <w:tcPr>
-            <w:shd w:val="clear" w:color="auto" w:fill="E8F0FE"/>
-          </w:tcPr>
-          <w:p>
-            <w:r>
-              <w:rPr>
-                <w:b/>
-              </w:rPr>
-              <w:t>Say</w:t>
-            </w:r>
-          </w:p>
-        </w:tc>
-        <w:tc>
-          <w:tcPr>
-            <w:shd w:val="clear" w:color="auto" w:fill="E8F0FE"/>
-          </w:tcPr>
-          <w:p>
-            <w:r>
-              <w:rPr>
-                <w:b/>
-              </w:rPr>
-              <w:t>INR &lt;&lt;say_value&gt;&gt;</w:t>
-            </w:r>
-          </w:p>
-        </w:tc>
-      </w:tr>
-    </w:tbl>
+    <w:p/>
     <w:p>
       <w:r>
         <w:t>&lt;&lt;VALUATION_SUMMARY_TABLE&gt;&gt;</w:t>

</xml_diff>